<commit_message>
(Feature) Phase 1: 3D Swirly Sphere
</commit_message>
<xml_diff>
--- a/documents/color_of_thoughts.docx
+++ b/documents/color_of_thoughts.docx
@@ -218,11 +218,212 @@
           <w:numId w:val="4"/>
         </w:numPr>
       </w:pPr>
-      <w:r>
-        <w:t xml:space="preserve">Supabase for this project - </w:t>
-      </w:r>
-      <w:r>
-        <w:t>store username, extracted colors, and their anonymous given name (avoid duplication)?</w:t>
+      <w:proofErr w:type="spellStart"/>
+      <w:r>
+        <w:t>Supabase</w:t>
+      </w:r>
+      <w:proofErr w:type="spellEnd"/>
+      <w:r>
+        <w:t xml:space="preserve"> for this project - store username, extracted colors, and their anonymous given name (avoid duplication)?</w:t>
+      </w:r>
+    </w:p>
+    <w:p/>
+    <w:p>
+      <w:r>
+        <w:lastRenderedPageBreak/>
+        <w:t>Suggestions:</w:t>
+      </w:r>
+    </w:p>
+    <w:p>
+      <w:pPr>
+        <w:pStyle w:val="ListParagraph"/>
+        <w:numPr>
+          <w:ilvl w:val="0"/>
+          <w:numId w:val="5"/>
+        </w:numPr>
+      </w:pPr>
+      <w:r>
+        <w:t>Make it more 3d - looking</w:t>
+      </w:r>
+    </w:p>
+    <w:p>
+      <w:pPr>
+        <w:pStyle w:val="ListParagraph"/>
+        <w:numPr>
+          <w:ilvl w:val="0"/>
+          <w:numId w:val="5"/>
+        </w:numPr>
+      </w:pPr>
+      <w:r>
+        <w:t>More movement (faster and to be able to bounce off the wall).</w:t>
+      </w:r>
+    </w:p>
+    <w:p>
+      <w:pPr>
+        <w:pStyle w:val="ListParagraph"/>
+        <w:numPr>
+          <w:ilvl w:val="0"/>
+          <w:numId w:val="5"/>
+        </w:numPr>
+      </w:pPr>
+      <w:r>
+        <w:t>Deconstruction of</w:t>
+      </w:r>
+      <w:r>
+        <w:t xml:space="preserve"> </w:t>
+      </w:r>
+      <w:r>
+        <w:t>the color composition from the upload sphere and represent it as much as resemble as possible (because maybe more than 1 color is being used).</w:t>
+      </w:r>
+    </w:p>
+    <w:p>
+      <w:pPr>
+        <w:pStyle w:val="ListParagraph"/>
+        <w:numPr>
+          <w:ilvl w:val="0"/>
+          <w:numId w:val="5"/>
+        </w:numPr>
+      </w:pPr>
+      <w:r>
+        <w:t xml:space="preserve">Include the feature of allowing picture </w:t>
+      </w:r>
+      <w:r>
+        <w:t>crops</w:t>
+      </w:r>
+      <w:r>
+        <w:t xml:space="preserve"> for the user.</w:t>
+      </w:r>
+    </w:p>
+    <w:p>
+      <w:pPr>
+        <w:pStyle w:val="ListParagraph"/>
+        <w:numPr>
+          <w:ilvl w:val="0"/>
+          <w:numId w:val="5"/>
+        </w:numPr>
+      </w:pPr>
+      <w:r>
+        <w:t>Allow users to write a sentence.</w:t>
+      </w:r>
+    </w:p>
+    <w:p>
+      <w:pPr>
+        <w:pStyle w:val="ListParagraph"/>
+        <w:numPr>
+          <w:ilvl w:val="0"/>
+          <w:numId w:val="5"/>
+        </w:numPr>
+      </w:pPr>
+      <w:r>
+        <w:t>Name:</w:t>
+      </w:r>
+    </w:p>
+    <w:p>
+      <w:pPr>
+        <w:pStyle w:val="ListParagraph"/>
+        <w:numPr>
+          <w:ilvl w:val="0"/>
+          <w:numId w:val="5"/>
+        </w:numPr>
+      </w:pPr>
+      <w:r>
+        <w:t>Age:</w:t>
+      </w:r>
+    </w:p>
+    <w:p>
+      <w:pPr>
+        <w:pStyle w:val="ListParagraph"/>
+        <w:numPr>
+          <w:ilvl w:val="0"/>
+          <w:numId w:val="5"/>
+        </w:numPr>
+      </w:pPr>
+      <w:r>
+        <w:t>The big 5 personality traits</w:t>
+      </w:r>
+      <w:r>
+        <w:t xml:space="preserve"> (possible 5 or 10? Self-grading)</w:t>
+      </w:r>
+      <w:r>
+        <w:t>:</w:t>
+      </w:r>
+    </w:p>
+    <w:p>
+      <w:pPr>
+        <w:pStyle w:val="ListParagraph"/>
+        <w:numPr>
+          <w:ilvl w:val="1"/>
+          <w:numId w:val="5"/>
+        </w:numPr>
+      </w:pPr>
+      <w:r>
+        <w:t>O</w:t>
+      </w:r>
+      <w:r>
+        <w:t>penness</w:t>
+      </w:r>
+      <w:r>
+        <w:t xml:space="preserve"> (creativity / </w:t>
+      </w:r>
+      <w:r>
+        <w:t>curiosity</w:t>
+      </w:r>
+      <w:r>
+        <w:t>)</w:t>
+      </w:r>
+    </w:p>
+    <w:p>
+      <w:pPr>
+        <w:pStyle w:val="ListParagraph"/>
+        <w:numPr>
+          <w:ilvl w:val="1"/>
+          <w:numId w:val="5"/>
+        </w:numPr>
+      </w:pPr>
+      <w:r>
+        <w:t>Conscientiousness</w:t>
+      </w:r>
+      <w:r>
+        <w:t xml:space="preserve"> (diligence/self-control)</w:t>
+      </w:r>
+    </w:p>
+    <w:p>
+      <w:pPr>
+        <w:pStyle w:val="ListParagraph"/>
+        <w:numPr>
+          <w:ilvl w:val="1"/>
+          <w:numId w:val="5"/>
+        </w:numPr>
+      </w:pPr>
+      <w:r>
+        <w:t>Extraversion (social energy)</w:t>
+      </w:r>
+    </w:p>
+    <w:p>
+      <w:pPr>
+        <w:pStyle w:val="ListParagraph"/>
+        <w:numPr>
+          <w:ilvl w:val="1"/>
+          <w:numId w:val="5"/>
+        </w:numPr>
+      </w:pPr>
+      <w:r>
+        <w:t>Agreeableness (cooperation / kindness)</w:t>
+      </w:r>
+    </w:p>
+    <w:p>
+      <w:pPr>
+        <w:pStyle w:val="ListParagraph"/>
+        <w:numPr>
+          <w:ilvl w:val="1"/>
+          <w:numId w:val="5"/>
+        </w:numPr>
+      </w:pPr>
+      <w:r>
+        <w:t>Neuroticism (emotional stability / anxiety)</w:t>
+      </w:r>
+      <w:r>
+        <w:br/>
       </w:r>
     </w:p>
     <w:p/>
@@ -578,6 +779,119 @@
     </w:lvl>
   </w:abstractNum>
   <w:abstractNum w:abstractNumId="3" w15:restartNumberingAfterBreak="0">
+    <w:nsid w:val="68D33927"/>
+    <w:multiLevelType w:val="hybridMultilevel"/>
+    <w:tmpl w:val="B598FE46"/>
+    <w:lvl w:ilvl="0" w:tplc="04090001">
+      <w:start w:val="1"/>
+      <w:numFmt w:val="bullet"/>
+      <w:lvlText w:val=""/>
+      <w:lvlJc w:val="left"/>
+      <w:pPr>
+        <w:ind w:left="720" w:hanging="360"/>
+      </w:pPr>
+      <w:rPr>
+        <w:rFonts w:ascii="Symbol" w:hAnsi="Symbol" w:hint="default"/>
+      </w:rPr>
+    </w:lvl>
+    <w:lvl w:ilvl="1" w:tplc="04090003">
+      <w:start w:val="1"/>
+      <w:numFmt w:val="bullet"/>
+      <w:lvlText w:val="o"/>
+      <w:lvlJc w:val="left"/>
+      <w:pPr>
+        <w:ind w:left="1440" w:hanging="360"/>
+      </w:pPr>
+      <w:rPr>
+        <w:rFonts w:ascii="Courier New" w:hAnsi="Courier New" w:cs="Courier New" w:hint="default"/>
+      </w:rPr>
+    </w:lvl>
+    <w:lvl w:ilvl="2" w:tplc="04090005" w:tentative="1">
+      <w:start w:val="1"/>
+      <w:numFmt w:val="bullet"/>
+      <w:lvlText w:val=""/>
+      <w:lvlJc w:val="left"/>
+      <w:pPr>
+        <w:ind w:left="2160" w:hanging="360"/>
+      </w:pPr>
+      <w:rPr>
+        <w:rFonts w:ascii="Wingdings" w:hAnsi="Wingdings" w:hint="default"/>
+      </w:rPr>
+    </w:lvl>
+    <w:lvl w:ilvl="3" w:tplc="04090001" w:tentative="1">
+      <w:start w:val="1"/>
+      <w:numFmt w:val="bullet"/>
+      <w:lvlText w:val=""/>
+      <w:lvlJc w:val="left"/>
+      <w:pPr>
+        <w:ind w:left="2880" w:hanging="360"/>
+      </w:pPr>
+      <w:rPr>
+        <w:rFonts w:ascii="Symbol" w:hAnsi="Symbol" w:hint="default"/>
+      </w:rPr>
+    </w:lvl>
+    <w:lvl w:ilvl="4" w:tplc="04090003" w:tentative="1">
+      <w:start w:val="1"/>
+      <w:numFmt w:val="bullet"/>
+      <w:lvlText w:val="o"/>
+      <w:lvlJc w:val="left"/>
+      <w:pPr>
+        <w:ind w:left="3600" w:hanging="360"/>
+      </w:pPr>
+      <w:rPr>
+        <w:rFonts w:ascii="Courier New" w:hAnsi="Courier New" w:cs="Courier New" w:hint="default"/>
+      </w:rPr>
+    </w:lvl>
+    <w:lvl w:ilvl="5" w:tplc="04090005" w:tentative="1">
+      <w:start w:val="1"/>
+      <w:numFmt w:val="bullet"/>
+      <w:lvlText w:val=""/>
+      <w:lvlJc w:val="left"/>
+      <w:pPr>
+        <w:ind w:left="4320" w:hanging="360"/>
+      </w:pPr>
+      <w:rPr>
+        <w:rFonts w:ascii="Wingdings" w:hAnsi="Wingdings" w:hint="default"/>
+      </w:rPr>
+    </w:lvl>
+    <w:lvl w:ilvl="6" w:tplc="04090001" w:tentative="1">
+      <w:start w:val="1"/>
+      <w:numFmt w:val="bullet"/>
+      <w:lvlText w:val=""/>
+      <w:lvlJc w:val="left"/>
+      <w:pPr>
+        <w:ind w:left="5040" w:hanging="360"/>
+      </w:pPr>
+      <w:rPr>
+        <w:rFonts w:ascii="Symbol" w:hAnsi="Symbol" w:hint="default"/>
+      </w:rPr>
+    </w:lvl>
+    <w:lvl w:ilvl="7" w:tplc="04090003" w:tentative="1">
+      <w:start w:val="1"/>
+      <w:numFmt w:val="bullet"/>
+      <w:lvlText w:val="o"/>
+      <w:lvlJc w:val="left"/>
+      <w:pPr>
+        <w:ind w:left="5760" w:hanging="360"/>
+      </w:pPr>
+      <w:rPr>
+        <w:rFonts w:ascii="Courier New" w:hAnsi="Courier New" w:cs="Courier New" w:hint="default"/>
+      </w:rPr>
+    </w:lvl>
+    <w:lvl w:ilvl="8" w:tplc="04090005" w:tentative="1">
+      <w:start w:val="1"/>
+      <w:numFmt w:val="bullet"/>
+      <w:lvlText w:val=""/>
+      <w:lvlJc w:val="left"/>
+      <w:pPr>
+        <w:ind w:left="6480" w:hanging="360"/>
+      </w:pPr>
+      <w:rPr>
+        <w:rFonts w:ascii="Wingdings" w:hAnsi="Wingdings" w:hint="default"/>
+      </w:rPr>
+    </w:lvl>
+  </w:abstractNum>
+  <w:abstractNum w:abstractNumId="4" w15:restartNumberingAfterBreak="0">
     <w:nsid w:val="7AB30B1E"/>
     <w:multiLevelType w:val="hybridMultilevel"/>
     <w:tmpl w:val="5C963BE6"/>
@@ -697,10 +1011,13 @@
     <w:abstractNumId w:val="2"/>
   </w:num>
   <w:num w:numId="3" w16cid:durableId="1800801900">
-    <w:abstractNumId w:val="3"/>
+    <w:abstractNumId w:val="4"/>
   </w:num>
   <w:num w:numId="4" w16cid:durableId="2035225679">
     <w:abstractNumId w:val="1"/>
+  </w:num>
+  <w:num w:numId="5" w16cid:durableId="873427894">
+    <w:abstractNumId w:val="3"/>
   </w:num>
 </w:numbering>
 </file>

</xml_diff>

<commit_message>
(Feature) Phase 1: Add testing URLs
</commit_message>
<xml_diff>
--- a/documents/color_of_thoughts.docx
+++ b/documents/color_of_thoughts.docx
@@ -218,13 +218,8 @@
           <w:numId w:val="4"/>
         </w:numPr>
       </w:pPr>
-      <w:proofErr w:type="spellStart"/>
-      <w:r>
-        <w:t>Supabase</w:t>
-      </w:r>
-      <w:proofErr w:type="spellEnd"/>
-      <w:r>
-        <w:t xml:space="preserve"> for this project - store username, extracted colors, and their anonymous given name (avoid duplication)?</w:t>
+      <w:r>
+        <w:t>Supabase for this project - store username, extracted colors, and their anonymous given name (avoid duplication)?</w:t>
       </w:r>
     </w:p>
     <w:p/>
@@ -426,7 +421,32 @@
         <w:br/>
       </w:r>
     </w:p>
-    <w:p/>
+    <w:p>
+      <w:r>
+        <w:t xml:space="preserve">Test: </w:t>
+      </w:r>
+    </w:p>
+    <w:p>
+      <w:hyperlink r:id="rId5" w:history="1">
+        <w:r>
+          <w:rPr>
+            <w:rStyle w:val="Hyperlink"/>
+          </w:rPr>
+          <w:t>http://localhost:5173/wall?test=30&amp;&amp;mode=bands</w:t>
+        </w:r>
+      </w:hyperlink>
+      <w:r>
+        <w:br/>
+      </w:r>
+      <w:r>
+        <w:br/>
+        <w:t>thay test=## (number of blobs)</w:t>
+      </w:r>
+      <w:r>
+        <w:br/>
+        <w:t xml:space="preserve">           mode=## (bands - hidden, orbit, or flow)</w:t>
+      </w:r>
+    </w:p>
     <w:sectPr>
       <w:pgSz w:w="12240" w:h="15840"/>
       <w:pgMar w:top="1440" w:right="1440" w:bottom="1440" w:left="1440" w:header="720" w:footer="720" w:gutter="0"/>
@@ -1625,7 +1645,6 @@
   <w:style w:type="character" w:default="1" w:styleId="DefaultParagraphFont">
     <w:name w:val="Default Paragraph Font"/>
     <w:uiPriority w:val="1"/>
-    <w:semiHidden/>
     <w:unhideWhenUsed/>
   </w:style>
   <w:style w:type="table" w:default="1" w:styleId="TableNormal">
@@ -1937,6 +1956,29 @@
       <w:smallCaps/>
       <w:color w:val="0F4761" w:themeColor="accent1" w:themeShade="BF"/>
       <w:spacing w:val="5"/>
+    </w:rPr>
+  </w:style>
+  <w:style w:type="character" w:styleId="Hyperlink">
+    <w:name w:val="Hyperlink"/>
+    <w:basedOn w:val="DefaultParagraphFont"/>
+    <w:uiPriority w:val="99"/>
+    <w:unhideWhenUsed/>
+    <w:rsid w:val="00F04D28"/>
+    <w:rPr>
+      <w:color w:val="467886" w:themeColor="hyperlink"/>
+      <w:u w:val="single"/>
+    </w:rPr>
+  </w:style>
+  <w:style w:type="character" w:styleId="UnresolvedMention">
+    <w:name w:val="Unresolved Mention"/>
+    <w:basedOn w:val="DefaultParagraphFont"/>
+    <w:uiPriority w:val="99"/>
+    <w:semiHidden/>
+    <w:unhideWhenUsed/>
+    <w:rsid w:val="00F04D28"/>
+    <w:rPr>
+      <w:color w:val="605E5C"/>
+      <w:shd w:val="clear" w:color="auto" w:fill="E1DFDD"/>
     </w:rPr>
   </w:style>
 </w:styles>

</xml_diff>

<commit_message>
(Feature) Phase 1: Sea Wave Mode
</commit_message>
<xml_diff>
--- a/documents/color_of_thoughts.docx
+++ b/documents/color_of_thoughts.docx
@@ -445,6 +445,95 @@
       <w:r>
         <w:br/>
         <w:t xml:space="preserve">           mode=## (bands - hidden, orbit, or flow)</w:t>
+      </w:r>
+    </w:p>
+    <w:p/>
+    <w:p>
+      <w:r>
+        <w:t>“Blobs” presentation on the wall:</w:t>
+      </w:r>
+    </w:p>
+    <w:p>
+      <w:r>
+        <w:t>1. Sea wave</w:t>
+      </w:r>
+    </w:p>
+    <w:p>
+      <w:pPr>
+        <w:pStyle w:val="ListParagraph"/>
+        <w:numPr>
+          <w:ilvl w:val="0"/>
+          <w:numId w:val="8"/>
+        </w:numPr>
+      </w:pPr>
+      <w:r>
+        <w:t>Generate a sea wave on the wall that make up of generated “blobs”</w:t>
+      </w:r>
+    </w:p>
+    <w:p>
+      <w:pPr>
+        <w:pStyle w:val="ListParagraph"/>
+        <w:numPr>
+          <w:ilvl w:val="0"/>
+          <w:numId w:val="8"/>
+        </w:numPr>
+      </w:pPr>
+      <w:r>
+        <w:t>Depending on the total number of high turbulent “Blobs” (4-5) vs low turbulent “Blobs” =&gt; Lead to different sea wave animation intensity.</w:t>
+      </w:r>
+    </w:p>
+    <w:p>
+      <w:pPr>
+        <w:pStyle w:val="ListParagraph"/>
+        <w:numPr>
+          <w:ilvl w:val="1"/>
+          <w:numId w:val="8"/>
+        </w:numPr>
+      </w:pPr>
+      <w:r>
+        <w:t xml:space="preserve">If balance, then normal </w:t>
+      </w:r>
+    </w:p>
+    <w:p>
+      <w:r>
+        <w:t>2. Mandala Art Inspiration</w:t>
+      </w:r>
+    </w:p>
+    <w:p>
+      <w:pPr>
+        <w:pStyle w:val="ListParagraph"/>
+        <w:numPr>
+          <w:ilvl w:val="0"/>
+          <w:numId w:val="9"/>
+        </w:numPr>
+      </w:pPr>
+      <w:r>
+        <w:t>Calm “Blobs” (1 to 2) will try to accumulate to generate some kind shape or drawing (3D, if possible).</w:t>
+      </w:r>
+    </w:p>
+    <w:p>
+      <w:pPr>
+        <w:pStyle w:val="ListParagraph"/>
+        <w:numPr>
+          <w:ilvl w:val="0"/>
+          <w:numId w:val="9"/>
+        </w:numPr>
+      </w:pPr>
+      <w:r>
+        <w:t>Turbulent “Blobs” (4-5) will move chaotic-ly and once it collides with the underconstruction “shape” will knock down the shape bit by bit.</w:t>
+      </w:r>
+    </w:p>
+    <w:p>
+      <w:pPr>
+        <w:pStyle w:val="ListParagraph"/>
+        <w:numPr>
+          <w:ilvl w:val="0"/>
+          <w:numId w:val="9"/>
+        </w:numPr>
+      </w:pPr>
+      <w:r>
+        <w:lastRenderedPageBreak/>
+        <w:t>Level 3 turbulent will be more of neutral, flow / drift normally and if collide with the shape, it can 50/50 bounce away or “help in” the construction.</w:t>
       </w:r>
     </w:p>
     <w:sectPr>
@@ -460,6 +549,101 @@
 <file path=word/numbering.xml><?xml version="1.0" encoding="utf-8"?>
 <w:numbering xmlns:wpc="http://schemas.microsoft.com/office/word/2010/wordprocessingCanvas" xmlns:cx="http://schemas.microsoft.com/office/drawing/2014/chartex" xmlns:cx1="http://schemas.microsoft.com/office/drawing/2015/9/8/chartex" xmlns:cx2="http://schemas.microsoft.com/office/drawing/2015/10/21/chartex" xmlns:cx3="http://schemas.microsoft.com/office/drawing/2016/5/9/chartex" xmlns:cx4="http://schemas.microsoft.com/office/drawing/2016/5/10/chartex" xmlns:cx5="http://schemas.microsoft.com/office/drawing/2016/5/11/chartex" xmlns:cx6="http://schemas.microsoft.com/office/drawing/2016/5/12/chartex" xmlns:cx7="http://schemas.microsoft.com/office/drawing/2016/5/13/chartex" xmlns:cx8="http://schemas.microsoft.com/office/drawing/2016/5/14/chartex" xmlns:mc="http://schemas.openxmlformats.org/markup-compatibility/2006" xmlns:aink="http://schemas.microsoft.com/office/drawing/2016/ink" xmlns:am3d="http://schemas.microsoft.com/office/drawing/2017/model3d" xmlns:o="urn:schemas-microsoft-com:office:office" xmlns:oel="http://schemas.microsoft.com/office/2019/extlst" xmlns:r="http://schemas.openxmlformats.org/officeDocument/2006/relationships" xmlns:m="http://schemas.openxmlformats.org/officeDocument/2006/math" xmlns:v="urn:schemas-microsoft-com:vml" xmlns:wp14="http://schemas.microsoft.com/office/word/2010/wordprocessingDrawing" xmlns:wp="http://schemas.openxmlformats.org/drawingml/2006/wordprocessingDrawing" xmlns:w10="urn:schemas-microsoft-com:office:word" xmlns:w="http://schemas.openxmlformats.org/wordprocessingml/2006/main" xmlns:w14="http://schemas.microsoft.com/office/word/2010/wordml" xmlns:w15="http://schemas.microsoft.com/office/word/2012/wordml" xmlns:w16cex="http://schemas.microsoft.com/office/word/2018/wordml/cex" xmlns:w16cid="http://schemas.microsoft.com/office/word/2016/wordml/cid" xmlns:w16="http://schemas.microsoft.com/office/word/2018/wordml" xmlns:w16du="http://schemas.microsoft.com/office/word/2023/wordml/word16du" xmlns:w16sdtdh="http://schemas.microsoft.com/office/word/2020/wordml/sdtdatahash" xmlns:w16sdtfl="http://schemas.microsoft.com/office/word/2024/wordml/sdtformatlock" xmlns:w16se="http://schemas.microsoft.com/office/word/2015/wordml/symex" xmlns:wpg="http://schemas.microsoft.com/office/word/2010/wordprocessingGroup" xmlns:wpi="http://schemas.microsoft.com/office/word/2010/wordprocessingInk" xmlns:wne="http://schemas.microsoft.com/office/word/2006/wordml" xmlns:wps="http://schemas.microsoft.com/office/word/2010/wordprocessingShape" mc:Ignorable="w14 w15 w16se w16cid w16 w16cex w16sdtdh w16sdtfl w16du wp14">
   <w:abstractNum w:abstractNumId="0" w15:restartNumberingAfterBreak="0">
+    <w:nsid w:val="2FF62909"/>
+    <w:multiLevelType w:val="hybridMultilevel"/>
+    <w:tmpl w:val="038EE262"/>
+    <w:lvl w:ilvl="0" w:tplc="FFFFFFFF">
+      <w:start w:val="1"/>
+      <w:numFmt w:val="decimal"/>
+      <w:lvlText w:val="%1."/>
+      <w:lvlJc w:val="left"/>
+      <w:pPr>
+        <w:ind w:left="720" w:hanging="360"/>
+      </w:pPr>
+      <w:rPr>
+        <w:rFonts w:asciiTheme="minorHAnsi" w:eastAsiaTheme="minorHAnsi" w:hAnsiTheme="minorHAnsi" w:cstheme="minorBidi"/>
+      </w:rPr>
+    </w:lvl>
+    <w:lvl w:ilvl="1" w:tplc="FFFFFFFF">
+      <w:start w:val="1"/>
+      <w:numFmt w:val="bullet"/>
+      <w:lvlText w:val=""/>
+      <w:lvlJc w:val="left"/>
+      <w:pPr>
+        <w:ind w:left="720" w:hanging="360"/>
+      </w:pPr>
+      <w:rPr>
+        <w:rFonts w:ascii="Symbol" w:hAnsi="Symbol" w:hint="default"/>
+      </w:rPr>
+    </w:lvl>
+    <w:lvl w:ilvl="2" w:tplc="FFFFFFFF">
+      <w:start w:val="1"/>
+      <w:numFmt w:val="bullet"/>
+      <w:lvlText w:val=""/>
+      <w:lvlJc w:val="left"/>
+      <w:pPr>
+        <w:ind w:left="720" w:hanging="360"/>
+      </w:pPr>
+      <w:rPr>
+        <w:rFonts w:ascii="Symbol" w:hAnsi="Symbol" w:hint="default"/>
+      </w:rPr>
+    </w:lvl>
+    <w:lvl w:ilvl="3" w:tplc="FFFFFFFF" w:tentative="1">
+      <w:start w:val="1"/>
+      <w:numFmt w:val="decimal"/>
+      <w:lvlText w:val="%4."/>
+      <w:lvlJc w:val="left"/>
+      <w:pPr>
+        <w:ind w:left="2880" w:hanging="360"/>
+      </w:pPr>
+    </w:lvl>
+    <w:lvl w:ilvl="4" w:tplc="FFFFFFFF" w:tentative="1">
+      <w:start w:val="1"/>
+      <w:numFmt w:val="lowerLetter"/>
+      <w:lvlText w:val="%5."/>
+      <w:lvlJc w:val="left"/>
+      <w:pPr>
+        <w:ind w:left="3600" w:hanging="360"/>
+      </w:pPr>
+    </w:lvl>
+    <w:lvl w:ilvl="5" w:tplc="FFFFFFFF" w:tentative="1">
+      <w:start w:val="1"/>
+      <w:numFmt w:val="lowerRoman"/>
+      <w:lvlText w:val="%6."/>
+      <w:lvlJc w:val="right"/>
+      <w:pPr>
+        <w:ind w:left="4320" w:hanging="180"/>
+      </w:pPr>
+    </w:lvl>
+    <w:lvl w:ilvl="6" w:tplc="FFFFFFFF" w:tentative="1">
+      <w:start w:val="1"/>
+      <w:numFmt w:val="decimal"/>
+      <w:lvlText w:val="%7."/>
+      <w:lvlJc w:val="left"/>
+      <w:pPr>
+        <w:ind w:left="5040" w:hanging="360"/>
+      </w:pPr>
+    </w:lvl>
+    <w:lvl w:ilvl="7" w:tplc="FFFFFFFF" w:tentative="1">
+      <w:start w:val="1"/>
+      <w:numFmt w:val="lowerLetter"/>
+      <w:lvlText w:val="%8."/>
+      <w:lvlJc w:val="left"/>
+      <w:pPr>
+        <w:ind w:left="5760" w:hanging="360"/>
+      </w:pPr>
+    </w:lvl>
+    <w:lvl w:ilvl="8" w:tplc="FFFFFFFF" w:tentative="1">
+      <w:start w:val="1"/>
+      <w:numFmt w:val="lowerRoman"/>
+      <w:lvlText w:val="%9."/>
+      <w:lvlJc w:val="right"/>
+      <w:pPr>
+        <w:ind w:left="6480" w:hanging="180"/>
+      </w:pPr>
+    </w:lvl>
+  </w:abstractNum>
+  <w:abstractNum w:abstractNumId="1" w15:restartNumberingAfterBreak="0">
     <w:nsid w:val="395418D5"/>
     <w:multiLevelType w:val="hybridMultilevel"/>
     <w:tmpl w:val="952E9BEA"/>
@@ -572,7 +756,7 @@
       </w:rPr>
     </w:lvl>
   </w:abstractNum>
-  <w:abstractNum w:abstractNumId="1" w15:restartNumberingAfterBreak="0">
+  <w:abstractNum w:abstractNumId="2" w15:restartNumberingAfterBreak="0">
     <w:nsid w:val="424C2462"/>
     <w:multiLevelType w:val="hybridMultilevel"/>
     <w:tmpl w:val="1D1ACC3A"/>
@@ -685,7 +869,120 @@
       </w:rPr>
     </w:lvl>
   </w:abstractNum>
-  <w:abstractNum w:abstractNumId="2" w15:restartNumberingAfterBreak="0">
+  <w:abstractNum w:abstractNumId="3" w15:restartNumberingAfterBreak="0">
+    <w:nsid w:val="49963D0D"/>
+    <w:multiLevelType w:val="hybridMultilevel"/>
+    <w:tmpl w:val="BAC6BB98"/>
+    <w:lvl w:ilvl="0" w:tplc="04090001">
+      <w:start w:val="1"/>
+      <w:numFmt w:val="bullet"/>
+      <w:lvlText w:val=""/>
+      <w:lvlJc w:val="left"/>
+      <w:pPr>
+        <w:ind w:left="720" w:hanging="360"/>
+      </w:pPr>
+      <w:rPr>
+        <w:rFonts w:ascii="Symbol" w:hAnsi="Symbol" w:hint="default"/>
+      </w:rPr>
+    </w:lvl>
+    <w:lvl w:ilvl="1" w:tplc="04090003">
+      <w:start w:val="1"/>
+      <w:numFmt w:val="bullet"/>
+      <w:lvlText w:val="o"/>
+      <w:lvlJc w:val="left"/>
+      <w:pPr>
+        <w:ind w:left="1440" w:hanging="360"/>
+      </w:pPr>
+      <w:rPr>
+        <w:rFonts w:ascii="Courier New" w:hAnsi="Courier New" w:cs="Courier New" w:hint="default"/>
+      </w:rPr>
+    </w:lvl>
+    <w:lvl w:ilvl="2" w:tplc="04090005" w:tentative="1">
+      <w:start w:val="1"/>
+      <w:numFmt w:val="bullet"/>
+      <w:lvlText w:val=""/>
+      <w:lvlJc w:val="left"/>
+      <w:pPr>
+        <w:ind w:left="2160" w:hanging="360"/>
+      </w:pPr>
+      <w:rPr>
+        <w:rFonts w:ascii="Wingdings" w:hAnsi="Wingdings" w:hint="default"/>
+      </w:rPr>
+    </w:lvl>
+    <w:lvl w:ilvl="3" w:tplc="04090001" w:tentative="1">
+      <w:start w:val="1"/>
+      <w:numFmt w:val="bullet"/>
+      <w:lvlText w:val=""/>
+      <w:lvlJc w:val="left"/>
+      <w:pPr>
+        <w:ind w:left="2880" w:hanging="360"/>
+      </w:pPr>
+      <w:rPr>
+        <w:rFonts w:ascii="Symbol" w:hAnsi="Symbol" w:hint="default"/>
+      </w:rPr>
+    </w:lvl>
+    <w:lvl w:ilvl="4" w:tplc="04090003" w:tentative="1">
+      <w:start w:val="1"/>
+      <w:numFmt w:val="bullet"/>
+      <w:lvlText w:val="o"/>
+      <w:lvlJc w:val="left"/>
+      <w:pPr>
+        <w:ind w:left="3600" w:hanging="360"/>
+      </w:pPr>
+      <w:rPr>
+        <w:rFonts w:ascii="Courier New" w:hAnsi="Courier New" w:cs="Courier New" w:hint="default"/>
+      </w:rPr>
+    </w:lvl>
+    <w:lvl w:ilvl="5" w:tplc="04090005" w:tentative="1">
+      <w:start w:val="1"/>
+      <w:numFmt w:val="bullet"/>
+      <w:lvlText w:val=""/>
+      <w:lvlJc w:val="left"/>
+      <w:pPr>
+        <w:ind w:left="4320" w:hanging="360"/>
+      </w:pPr>
+      <w:rPr>
+        <w:rFonts w:ascii="Wingdings" w:hAnsi="Wingdings" w:hint="default"/>
+      </w:rPr>
+    </w:lvl>
+    <w:lvl w:ilvl="6" w:tplc="04090001" w:tentative="1">
+      <w:start w:val="1"/>
+      <w:numFmt w:val="bullet"/>
+      <w:lvlText w:val=""/>
+      <w:lvlJc w:val="left"/>
+      <w:pPr>
+        <w:ind w:left="5040" w:hanging="360"/>
+      </w:pPr>
+      <w:rPr>
+        <w:rFonts w:ascii="Symbol" w:hAnsi="Symbol" w:hint="default"/>
+      </w:rPr>
+    </w:lvl>
+    <w:lvl w:ilvl="7" w:tplc="04090003" w:tentative="1">
+      <w:start w:val="1"/>
+      <w:numFmt w:val="bullet"/>
+      <w:lvlText w:val="o"/>
+      <w:lvlJc w:val="left"/>
+      <w:pPr>
+        <w:ind w:left="5760" w:hanging="360"/>
+      </w:pPr>
+      <w:rPr>
+        <w:rFonts w:ascii="Courier New" w:hAnsi="Courier New" w:cs="Courier New" w:hint="default"/>
+      </w:rPr>
+    </w:lvl>
+    <w:lvl w:ilvl="8" w:tplc="04090005" w:tentative="1">
+      <w:start w:val="1"/>
+      <w:numFmt w:val="bullet"/>
+      <w:lvlText w:val=""/>
+      <w:lvlJc w:val="left"/>
+      <w:pPr>
+        <w:ind w:left="6480" w:hanging="360"/>
+      </w:pPr>
+      <w:rPr>
+        <w:rFonts w:ascii="Wingdings" w:hAnsi="Wingdings" w:hint="default"/>
+      </w:rPr>
+    </w:lvl>
+  </w:abstractNum>
+  <w:abstractNum w:abstractNumId="4" w15:restartNumberingAfterBreak="0">
     <w:nsid w:val="4DC678C1"/>
     <w:multiLevelType w:val="hybridMultilevel"/>
     <w:tmpl w:val="B3EE4F3C"/>
@@ -798,7 +1095,102 @@
       </w:rPr>
     </w:lvl>
   </w:abstractNum>
-  <w:abstractNum w:abstractNumId="3" w15:restartNumberingAfterBreak="0">
+  <w:abstractNum w:abstractNumId="5" w15:restartNumberingAfterBreak="0">
+    <w:nsid w:val="53250882"/>
+    <w:multiLevelType w:val="hybridMultilevel"/>
+    <w:tmpl w:val="3F784D98"/>
+    <w:lvl w:ilvl="0" w:tplc="3BE0499A">
+      <w:start w:val="1"/>
+      <w:numFmt w:val="decimal"/>
+      <w:lvlText w:val="%1."/>
+      <w:lvlJc w:val="left"/>
+      <w:pPr>
+        <w:ind w:left="720" w:hanging="360"/>
+      </w:pPr>
+      <w:rPr>
+        <w:rFonts w:asciiTheme="minorHAnsi" w:eastAsiaTheme="minorHAnsi" w:hAnsiTheme="minorHAnsi" w:cstheme="minorBidi"/>
+      </w:rPr>
+    </w:lvl>
+    <w:lvl w:ilvl="1" w:tplc="04090001">
+      <w:start w:val="1"/>
+      <w:numFmt w:val="bullet"/>
+      <w:lvlText w:val=""/>
+      <w:lvlJc w:val="left"/>
+      <w:pPr>
+        <w:ind w:left="720" w:hanging="360"/>
+      </w:pPr>
+      <w:rPr>
+        <w:rFonts w:ascii="Symbol" w:hAnsi="Symbol" w:hint="default"/>
+      </w:rPr>
+    </w:lvl>
+    <w:lvl w:ilvl="2" w:tplc="04090001">
+      <w:start w:val="1"/>
+      <w:numFmt w:val="bullet"/>
+      <w:lvlText w:val=""/>
+      <w:lvlJc w:val="left"/>
+      <w:pPr>
+        <w:ind w:left="720" w:hanging="360"/>
+      </w:pPr>
+      <w:rPr>
+        <w:rFonts w:ascii="Symbol" w:hAnsi="Symbol" w:hint="default"/>
+      </w:rPr>
+    </w:lvl>
+    <w:lvl w:ilvl="3" w:tplc="0409000F" w:tentative="1">
+      <w:start w:val="1"/>
+      <w:numFmt w:val="decimal"/>
+      <w:lvlText w:val="%4."/>
+      <w:lvlJc w:val="left"/>
+      <w:pPr>
+        <w:ind w:left="2880" w:hanging="360"/>
+      </w:pPr>
+    </w:lvl>
+    <w:lvl w:ilvl="4" w:tplc="04090019" w:tentative="1">
+      <w:start w:val="1"/>
+      <w:numFmt w:val="lowerLetter"/>
+      <w:lvlText w:val="%5."/>
+      <w:lvlJc w:val="left"/>
+      <w:pPr>
+        <w:ind w:left="3600" w:hanging="360"/>
+      </w:pPr>
+    </w:lvl>
+    <w:lvl w:ilvl="5" w:tplc="0409001B" w:tentative="1">
+      <w:start w:val="1"/>
+      <w:numFmt w:val="lowerRoman"/>
+      <w:lvlText w:val="%6."/>
+      <w:lvlJc w:val="right"/>
+      <w:pPr>
+        <w:ind w:left="4320" w:hanging="180"/>
+      </w:pPr>
+    </w:lvl>
+    <w:lvl w:ilvl="6" w:tplc="0409000F" w:tentative="1">
+      <w:start w:val="1"/>
+      <w:numFmt w:val="decimal"/>
+      <w:lvlText w:val="%7."/>
+      <w:lvlJc w:val="left"/>
+      <w:pPr>
+        <w:ind w:left="5040" w:hanging="360"/>
+      </w:pPr>
+    </w:lvl>
+    <w:lvl w:ilvl="7" w:tplc="04090019" w:tentative="1">
+      <w:start w:val="1"/>
+      <w:numFmt w:val="lowerLetter"/>
+      <w:lvlText w:val="%8."/>
+      <w:lvlJc w:val="left"/>
+      <w:pPr>
+        <w:ind w:left="5760" w:hanging="360"/>
+      </w:pPr>
+    </w:lvl>
+    <w:lvl w:ilvl="8" w:tplc="0409001B" w:tentative="1">
+      <w:start w:val="1"/>
+      <w:numFmt w:val="lowerRoman"/>
+      <w:lvlText w:val="%9."/>
+      <w:lvlJc w:val="right"/>
+      <w:pPr>
+        <w:ind w:left="6480" w:hanging="180"/>
+      </w:pPr>
+    </w:lvl>
+  </w:abstractNum>
+  <w:abstractNum w:abstractNumId="6" w15:restartNumberingAfterBreak="0">
     <w:nsid w:val="68D33927"/>
     <w:multiLevelType w:val="hybridMultilevel"/>
     <w:tmpl w:val="B598FE46"/>
@@ -911,7 +1303,120 @@
       </w:rPr>
     </w:lvl>
   </w:abstractNum>
-  <w:abstractNum w:abstractNumId="4" w15:restartNumberingAfterBreak="0">
+  <w:abstractNum w:abstractNumId="7" w15:restartNumberingAfterBreak="0">
+    <w:nsid w:val="74F53932"/>
+    <w:multiLevelType w:val="hybridMultilevel"/>
+    <w:tmpl w:val="C334218A"/>
+    <w:lvl w:ilvl="0" w:tplc="04090001">
+      <w:start w:val="1"/>
+      <w:numFmt w:val="bullet"/>
+      <w:lvlText w:val=""/>
+      <w:lvlJc w:val="left"/>
+      <w:pPr>
+        <w:ind w:left="720" w:hanging="360"/>
+      </w:pPr>
+      <w:rPr>
+        <w:rFonts w:ascii="Symbol" w:hAnsi="Symbol" w:hint="default"/>
+      </w:rPr>
+    </w:lvl>
+    <w:lvl w:ilvl="1" w:tplc="04090003" w:tentative="1">
+      <w:start w:val="1"/>
+      <w:numFmt w:val="bullet"/>
+      <w:lvlText w:val="o"/>
+      <w:lvlJc w:val="left"/>
+      <w:pPr>
+        <w:ind w:left="1440" w:hanging="360"/>
+      </w:pPr>
+      <w:rPr>
+        <w:rFonts w:ascii="Courier New" w:hAnsi="Courier New" w:cs="Courier New" w:hint="default"/>
+      </w:rPr>
+    </w:lvl>
+    <w:lvl w:ilvl="2" w:tplc="04090005" w:tentative="1">
+      <w:start w:val="1"/>
+      <w:numFmt w:val="bullet"/>
+      <w:lvlText w:val=""/>
+      <w:lvlJc w:val="left"/>
+      <w:pPr>
+        <w:ind w:left="2160" w:hanging="360"/>
+      </w:pPr>
+      <w:rPr>
+        <w:rFonts w:ascii="Wingdings" w:hAnsi="Wingdings" w:hint="default"/>
+      </w:rPr>
+    </w:lvl>
+    <w:lvl w:ilvl="3" w:tplc="04090001" w:tentative="1">
+      <w:start w:val="1"/>
+      <w:numFmt w:val="bullet"/>
+      <w:lvlText w:val=""/>
+      <w:lvlJc w:val="left"/>
+      <w:pPr>
+        <w:ind w:left="2880" w:hanging="360"/>
+      </w:pPr>
+      <w:rPr>
+        <w:rFonts w:ascii="Symbol" w:hAnsi="Symbol" w:hint="default"/>
+      </w:rPr>
+    </w:lvl>
+    <w:lvl w:ilvl="4" w:tplc="04090003" w:tentative="1">
+      <w:start w:val="1"/>
+      <w:numFmt w:val="bullet"/>
+      <w:lvlText w:val="o"/>
+      <w:lvlJc w:val="left"/>
+      <w:pPr>
+        <w:ind w:left="3600" w:hanging="360"/>
+      </w:pPr>
+      <w:rPr>
+        <w:rFonts w:ascii="Courier New" w:hAnsi="Courier New" w:cs="Courier New" w:hint="default"/>
+      </w:rPr>
+    </w:lvl>
+    <w:lvl w:ilvl="5" w:tplc="04090005" w:tentative="1">
+      <w:start w:val="1"/>
+      <w:numFmt w:val="bullet"/>
+      <w:lvlText w:val=""/>
+      <w:lvlJc w:val="left"/>
+      <w:pPr>
+        <w:ind w:left="4320" w:hanging="360"/>
+      </w:pPr>
+      <w:rPr>
+        <w:rFonts w:ascii="Wingdings" w:hAnsi="Wingdings" w:hint="default"/>
+      </w:rPr>
+    </w:lvl>
+    <w:lvl w:ilvl="6" w:tplc="04090001" w:tentative="1">
+      <w:start w:val="1"/>
+      <w:numFmt w:val="bullet"/>
+      <w:lvlText w:val=""/>
+      <w:lvlJc w:val="left"/>
+      <w:pPr>
+        <w:ind w:left="5040" w:hanging="360"/>
+      </w:pPr>
+      <w:rPr>
+        <w:rFonts w:ascii="Symbol" w:hAnsi="Symbol" w:hint="default"/>
+      </w:rPr>
+    </w:lvl>
+    <w:lvl w:ilvl="7" w:tplc="04090003" w:tentative="1">
+      <w:start w:val="1"/>
+      <w:numFmt w:val="bullet"/>
+      <w:lvlText w:val="o"/>
+      <w:lvlJc w:val="left"/>
+      <w:pPr>
+        <w:ind w:left="5760" w:hanging="360"/>
+      </w:pPr>
+      <w:rPr>
+        <w:rFonts w:ascii="Courier New" w:hAnsi="Courier New" w:cs="Courier New" w:hint="default"/>
+      </w:rPr>
+    </w:lvl>
+    <w:lvl w:ilvl="8" w:tplc="04090005" w:tentative="1">
+      <w:start w:val="1"/>
+      <w:numFmt w:val="bullet"/>
+      <w:lvlText w:val=""/>
+      <w:lvlJc w:val="left"/>
+      <w:pPr>
+        <w:ind w:left="6480" w:hanging="360"/>
+      </w:pPr>
+      <w:rPr>
+        <w:rFonts w:ascii="Wingdings" w:hAnsi="Wingdings" w:hint="default"/>
+      </w:rPr>
+    </w:lvl>
+  </w:abstractNum>
+  <w:abstractNum w:abstractNumId="8" w15:restartNumberingAfterBreak="0">
     <w:nsid w:val="7AB30B1E"/>
     <w:multiLevelType w:val="hybridMultilevel"/>
     <w:tmpl w:val="5C963BE6"/>
@@ -1025,19 +1530,31 @@
     </w:lvl>
   </w:abstractNum>
   <w:num w:numId="1" w16cid:durableId="730857649">
+    <w:abstractNumId w:val="1"/>
+  </w:num>
+  <w:num w:numId="2" w16cid:durableId="1539274634">
+    <w:abstractNumId w:val="4"/>
+  </w:num>
+  <w:num w:numId="3" w16cid:durableId="1800801900">
+    <w:abstractNumId w:val="8"/>
+  </w:num>
+  <w:num w:numId="4" w16cid:durableId="2035225679">
+    <w:abstractNumId w:val="2"/>
+  </w:num>
+  <w:num w:numId="5" w16cid:durableId="873427894">
+    <w:abstractNumId w:val="6"/>
+  </w:num>
+  <w:num w:numId="6" w16cid:durableId="1003703366">
+    <w:abstractNumId w:val="5"/>
+  </w:num>
+  <w:num w:numId="7" w16cid:durableId="2046442613">
     <w:abstractNumId w:val="0"/>
   </w:num>
-  <w:num w:numId="2" w16cid:durableId="1539274634">
-    <w:abstractNumId w:val="2"/>
+  <w:num w:numId="8" w16cid:durableId="672531500">
+    <w:abstractNumId w:val="3"/>
   </w:num>
-  <w:num w:numId="3" w16cid:durableId="1800801900">
-    <w:abstractNumId w:val="4"/>
-  </w:num>
-  <w:num w:numId="4" w16cid:durableId="2035225679">
-    <w:abstractNumId w:val="1"/>
-  </w:num>
-  <w:num w:numId="5" w16cid:durableId="873427894">
-    <w:abstractNumId w:val="3"/>
+  <w:num w:numId="9" w16cid:durableId="2118013309">
+    <w:abstractNumId w:val="7"/>
   </w:num>
 </w:numbering>
 </file>
@@ -1645,6 +2162,7 @@
   <w:style w:type="character" w:default="1" w:styleId="DefaultParagraphFont">
     <w:name w:val="Default Paragraph Font"/>
     <w:uiPriority w:val="1"/>
+    <w:semiHidden/>
     <w:unhideWhenUsed/>
   </w:style>
   <w:style w:type="table" w:default="1" w:styleId="TableNormal">

</xml_diff>

<commit_message>
(Feature) Phase 1: Re-adjust to Mandala
</commit_message>
<xml_diff>
--- a/documents/color_of_thoughts.docx
+++ b/documents/color_of_thoughts.docx
@@ -154,7 +154,15 @@
         </w:numPr>
       </w:pPr>
       <w:r>
-        <w:t xml:space="preserve">The screen (from user device) will display that user’s generated sphere / cloud as highlight - after his / her input is processed - or too complicated to processed? </w:t>
+        <w:t xml:space="preserve">The screen (from user device) will display that user’s generated sphere / cloud as highlight - after his / her input is processed - or too complicated to </w:t>
+      </w:r>
+      <w:proofErr w:type="gramStart"/>
+      <w:r>
+        <w:t>processed</w:t>
+      </w:r>
+      <w:proofErr w:type="gramEnd"/>
+      <w:r>
+        <w:t xml:space="preserve">? </w:t>
       </w:r>
     </w:p>
     <w:p>
@@ -218,8 +226,13 @@
           <w:numId w:val="4"/>
         </w:numPr>
       </w:pPr>
-      <w:r>
-        <w:t>Supabase for this project - store username, extracted colors, and their anonymous given name (avoid duplication)?</w:t>
+      <w:proofErr w:type="spellStart"/>
+      <w:r>
+        <w:t>Supabase</w:t>
+      </w:r>
+      <w:proofErr w:type="spellEnd"/>
+      <w:r>
+        <w:t xml:space="preserve"> for this project - store username, extracted colors, and their anonymous given name (avoid duplication)?</w:t>
       </w:r>
     </w:p>
     <w:p/>
@@ -440,11 +453,34 @@
       </w:r>
       <w:r>
         <w:br/>
-        <w:t>thay test=## (number of blobs)</w:t>
+      </w:r>
+      <w:proofErr w:type="spellStart"/>
+      <w:r>
+        <w:t>thay</w:t>
+      </w:r>
+      <w:proofErr w:type="spellEnd"/>
+      <w:r>
+        <w:t xml:space="preserve"> test</w:t>
+      </w:r>
+      <w:proofErr w:type="gramStart"/>
+      <w:r>
+        <w:t>=## (</w:t>
+      </w:r>
+      <w:proofErr w:type="gramEnd"/>
+      <w:r>
+        <w:t>number of blobs)</w:t>
       </w:r>
       <w:r>
         <w:br/>
-        <w:t xml:space="preserve">           mode=## (bands - hidden, orbit, or flow)</w:t>
+        <w:t xml:space="preserve">           mode</w:t>
+      </w:r>
+      <w:proofErr w:type="gramStart"/>
+      <w:r>
+        <w:t>=## (</w:t>
+      </w:r>
+      <w:proofErr w:type="gramEnd"/>
+      <w:r>
+        <w:t>bands - hidden, orbit, or flow)</w:t>
       </w:r>
     </w:p>
     <w:p/>
@@ -520,7 +556,23 @@
         </w:numPr>
       </w:pPr>
       <w:r>
-        <w:t>Turbulent “Blobs” (4-5) will move chaotic-ly and once it collides with the underconstruction “shape” will knock down the shape bit by bit.</w:t>
+        <w:t>Turbulent “Blobs” (4-5) will move chaotic-</w:t>
+      </w:r>
+      <w:proofErr w:type="spellStart"/>
+      <w:r>
+        <w:t>ly</w:t>
+      </w:r>
+      <w:proofErr w:type="spellEnd"/>
+      <w:r>
+        <w:t xml:space="preserve"> and once it collides with the </w:t>
+      </w:r>
+      <w:proofErr w:type="spellStart"/>
+      <w:r>
+        <w:t>underconstruction</w:t>
+      </w:r>
+      <w:proofErr w:type="spellEnd"/>
+      <w:r>
+        <w:t xml:space="preserve"> “shape” will knock down the shape bit by bit.</w:t>
       </w:r>
     </w:p>
     <w:p>
@@ -534,6 +586,237 @@
       <w:r>
         <w:lastRenderedPageBreak/>
         <w:t>Level 3 turbulent will be more of neutral, flow / drift normally and if collide with the shape, it can 50/50 bounce away or “help in” the construction.</w:t>
+      </w:r>
+    </w:p>
+    <w:p/>
+    <w:p>
+      <w:r>
+        <w:t xml:space="preserve">http://localhost:5173/wall?mode=mandala                    </w:t>
+      </w:r>
+      <w:proofErr w:type="gramStart"/>
+      <w:r>
+        <w:t xml:space="preserve">   (</w:t>
+      </w:r>
+      <w:proofErr w:type="gramEnd"/>
+      <w:r>
+        <w:t>live data)</w:t>
+      </w:r>
+    </w:p>
+    <w:p>
+      <w:r>
+        <w:t xml:space="preserve">http://localhost:5173/wall?mode=mandala&amp;test=30            </w:t>
+      </w:r>
+      <w:proofErr w:type="gramStart"/>
+      <w:r>
+        <w:t xml:space="preserve">   (</w:t>
+      </w:r>
+      <w:proofErr w:type="gramEnd"/>
+      <w:r>
+        <w:t>30 synth blobs, mixed)</w:t>
+      </w:r>
+    </w:p>
+    <w:p>
+      <w:r>
+        <w:t xml:space="preserve">http://localhost:5173/wall?mode=mandala&amp;test=30&amp;storm=calm </w:t>
+      </w:r>
+      <w:proofErr w:type="gramStart"/>
+      <w:r>
+        <w:t xml:space="preserve">   (</w:t>
+      </w:r>
+      <w:proofErr w:type="gramEnd"/>
+      <w:r>
+        <w:t>mostly dock — pattern should complete)</w:t>
+      </w:r>
+    </w:p>
+    <w:p>
+      <w:proofErr w:type="gramStart"/>
+      <w:r>
+        <w:t>http://localhost:5173/wall?mode=mandala&amp;test=30&amp;storm=turbulent  (</w:t>
+      </w:r>
+      <w:proofErr w:type="gramEnd"/>
+      <w:r>
+        <w:t>mostly chaotic — pattern gets hammered)</w:t>
+      </w:r>
+    </w:p>
+    <w:p>
+      <w:r>
+        <w:t xml:space="preserve">http://localhost:5173/wall?mode=mandala&amp;test=30&amp;explore=1  </w:t>
+      </w:r>
+      <w:proofErr w:type="gramStart"/>
+      <w:r>
+        <w:t xml:space="preserve">   (</w:t>
+      </w:r>
+      <w:proofErr w:type="gramEnd"/>
+      <w:r>
+        <w:t>drag-orbit around the mandala)</w:t>
+      </w:r>
+      <w:r>
+        <w:br/>
+      </w:r>
+      <w:r>
+        <w:br/>
+      </w:r>
+      <w:r>
+        <w:t>Testing Mandala:</w:t>
+      </w:r>
+      <w:r>
+        <w:br/>
+      </w:r>
+      <w:r>
+        <w:t>/</w:t>
+      </w:r>
+      <w:proofErr w:type="spellStart"/>
+      <w:r>
+        <w:t>wall?mode</w:t>
+      </w:r>
+      <w:proofErr w:type="spellEnd"/>
+      <w:r>
+        <w:t>=</w:t>
+      </w:r>
+      <w:proofErr w:type="spellStart"/>
+      <w:r>
+        <w:t>mandala&amp;explore</w:t>
+      </w:r>
+      <w:proofErr w:type="spellEnd"/>
+      <w:r>
+        <w:t>=1</w:t>
+      </w:r>
+      <w:r>
+        <w:br/>
+      </w:r>
+      <w:r>
+        <w:br/>
+      </w:r>
+      <w:r>
+        <w:t>/</w:t>
+      </w:r>
+      <w:proofErr w:type="spellStart"/>
+      <w:r>
+        <w:t>wall?mode</w:t>
+      </w:r>
+      <w:proofErr w:type="spellEnd"/>
+      <w:r>
+        <w:t>=</w:t>
+      </w:r>
+      <w:proofErr w:type="spellStart"/>
+      <w:r>
+        <w:t>mandala&amp;explore</w:t>
+      </w:r>
+      <w:proofErr w:type="spellEnd"/>
+      <w:r>
+        <w:t>=1&amp;metFrac=0.5</w:t>
+      </w:r>
+    </w:p>
+    <w:p/>
+    <w:p>
+      <w:r>
+        <w:t>/</w:t>
+      </w:r>
+      <w:proofErr w:type="spellStart"/>
+      <w:proofErr w:type="gramStart"/>
+      <w:r>
+        <w:t>wall</w:t>
+      </w:r>
+      <w:proofErr w:type="gramEnd"/>
+      <w:r>
+        <w:t>?mode</w:t>
+      </w:r>
+      <w:proofErr w:type="spellEnd"/>
+      <w:r>
+        <w:t>=</w:t>
+      </w:r>
+      <w:proofErr w:type="spellStart"/>
+      <w:r>
+        <w:t>mandala&amp;explore</w:t>
+      </w:r>
+      <w:proofErr w:type="spellEnd"/>
+      <w:r>
+        <w:t>=1&amp;metFrac=1.5</w:t>
+      </w:r>
+    </w:p>
+    <w:p/>
+    <w:p>
+      <w:r>
+        <w:t>/</w:t>
+      </w:r>
+      <w:proofErr w:type="spellStart"/>
+      <w:proofErr w:type="gramStart"/>
+      <w:r>
+        <w:t>wall</w:t>
+      </w:r>
+      <w:proofErr w:type="gramEnd"/>
+      <w:r>
+        <w:t>?mode</w:t>
+      </w:r>
+      <w:proofErr w:type="spellEnd"/>
+      <w:r>
+        <w:t>=</w:t>
+      </w:r>
+      <w:proofErr w:type="spellStart"/>
+      <w:r>
+        <w:t>mandala&amp;explore</w:t>
+      </w:r>
+      <w:proofErr w:type="spellEnd"/>
+      <w:r>
+        <w:t>=1&amp;metFrac=2.0</w:t>
+      </w:r>
+      <w:r>
+        <w:br/>
+      </w:r>
+      <w:r>
+        <w:br/>
+      </w:r>
+      <w:r>
+        <w:t>/</w:t>
+      </w:r>
+      <w:proofErr w:type="spellStart"/>
+      <w:r>
+        <w:t>wall?mode</w:t>
+      </w:r>
+      <w:proofErr w:type="spellEnd"/>
+      <w:r>
+        <w:t>=</w:t>
+      </w:r>
+      <w:proofErr w:type="spellStart"/>
+      <w:r>
+        <w:t>mandala&amp;explore</w:t>
+      </w:r>
+      <w:proofErr w:type="spellEnd"/>
+      <w:r>
+        <w:t>=1&amp;metFrac=2.5</w:t>
+      </w:r>
+      <w:r>
+        <w:br/>
+      </w:r>
+      <w:r>
+        <w:br/>
+      </w:r>
+      <w:r>
+        <w:t>/</w:t>
+      </w:r>
+      <w:proofErr w:type="spellStart"/>
+      <w:r>
+        <w:t>wall?mode</w:t>
+      </w:r>
+      <w:proofErr w:type="spellEnd"/>
+      <w:r>
+        <w:t>=</w:t>
+      </w:r>
+      <w:proofErr w:type="spellStart"/>
+      <w:r>
+        <w:t>mandala&amp;test</w:t>
+      </w:r>
+      <w:proofErr w:type="spellEnd"/>
+      <w:r>
+        <w:t>=15&amp;storm=</w:t>
+      </w:r>
+      <w:proofErr w:type="spellStart"/>
+      <w:r>
+        <w:t>mixed&amp;explore</w:t>
+      </w:r>
+      <w:proofErr w:type="spellEnd"/>
+      <w:r>
+        <w:t>=1&amp;metFrac=1.0</w:t>
       </w:r>
     </w:p>
     <w:sectPr>
@@ -2162,7 +2445,6 @@
   <w:style w:type="character" w:default="1" w:styleId="DefaultParagraphFont">
     <w:name w:val="Default Paragraph Font"/>
     <w:uiPriority w:val="1"/>
-    <w:semiHidden/>
     <w:unhideWhenUsed/>
   </w:style>
   <w:style w:type="table" w:default="1" w:styleId="TableNormal">

</xml_diff>